<commit_message>
updated so that items with no registered shop have a warning (happy to change text, just couldnt think of anything) and if they the post is older than a week the post deletes off the home page :) also updated so that in item details the price is to the right decimal places
</commit_message>
<xml_diff>
--- a/KindFind Privacy Policy.docx
+++ b/KindFind Privacy Policy.docx
@@ -1,6 +1,6 @@
 
 <file path=word/document.xml><?xml version="1.0" encoding="utf-8"?>
-<w:document xmlns:wpc="http://schemas.microsoft.com/office/word/2010/wordprocessingCanvas" xmlns:cx="http://schemas.microsoft.com/office/drawing/2014/chartex" xmlns:cx1="http://schemas.microsoft.com/office/drawing/2015/9/8/chartex" xmlns:cx2="http://schemas.microsoft.com/office/drawing/2015/10/21/chartex" xmlns:cx3="http://schemas.microsoft.com/office/drawing/2016/5/9/chartex" xmlns:cx4="http://schemas.microsoft.com/office/drawing/2016/5/10/chartex" xmlns:cx5="http://schemas.microsoft.com/office/drawing/2016/5/11/chartex" xmlns:cx6="http://schemas.microsoft.com/office/drawing/2016/5/12/chartex" xmlns:cx7="http://schemas.microsoft.com/office/drawing/2016/5/13/chartex" xmlns:cx8="http://schemas.microsoft.com/office/drawing/2016/5/14/chartex" xmlns:mc="http://schemas.openxmlformats.org/markup-compatibility/2006" xmlns:aink="http://schemas.microsoft.com/office/drawing/2016/ink" xmlns:am3d="http://schemas.microsoft.com/office/drawing/2017/model3d" xmlns:o="urn:schemas-microsoft-com:office:office" xmlns:oel="http://schemas.microsoft.com/office/2019/extlst" xmlns:r="http://schemas.openxmlformats.org/officeDocument/2006/relationships" xmlns:m="http://schemas.openxmlformats.org/officeDocument/2006/math" xmlns:v="urn:schemas-microsoft-com:vml" xmlns:wp14="http://schemas.microsoft.com/office/word/2010/wordprocessingDrawing" xmlns:wp="http://schemas.openxmlformats.org/drawingml/2006/wordprocessingDrawing" xmlns:w10="urn:schemas-microsoft-com:office:word" xmlns:w="http://schemas.openxmlformats.org/wordprocessingml/2006/main" xmlns:w14="http://schemas.microsoft.com/office/word/2010/wordml" xmlns:w15="http://schemas.microsoft.com/office/word/2012/wordml" xmlns:w16cex="http://schemas.microsoft.com/office/word/2018/wordml/cex" xmlns:w16cid="http://schemas.microsoft.com/office/word/2016/wordml/cid" xmlns:w16="http://schemas.microsoft.com/office/word/2018/wordml" xmlns:w16du="http://schemas.microsoft.com/office/word/2023/wordml/word16du" xmlns:w16sdtdh="http://schemas.microsoft.com/office/word/2020/wordml/sdtdatahash" xmlns:w16sdtfl="http://schemas.microsoft.com/office/word/2024/wordml/sdtformatlock" xmlns:w16se="http://schemas.microsoft.com/office/word/2015/wordml/symex" xmlns:wpg="http://schemas.microsoft.com/office/word/2010/wordprocessingGroup" xmlns:wpi="http://schemas.microsoft.com/office/word/2010/wordprocessingInk" xmlns:wne="http://schemas.microsoft.com/office/word/2006/wordml" xmlns:wps="http://schemas.microsoft.com/office/word/2010/wordprocessingShape" mc:Ignorable="w14 w15 w16se w16cid w16 w16cex w16sdtdh w16sdtfl w16du wp14">
+<w:document xmlns:wpc="http://schemas.microsoft.com/office/word/2010/wordprocessingCanvas" xmlns:cx="http://schemas.microsoft.com/office/drawing/2014/chartex" xmlns:cx1="http://schemas.microsoft.com/office/drawing/2015/9/8/chartex" xmlns:cx2="http://schemas.microsoft.com/office/drawing/2015/10/21/chartex" xmlns:cx3="http://schemas.microsoft.com/office/drawing/2016/5/9/chartex" xmlns:cx4="http://schemas.microsoft.com/office/drawing/2016/5/10/chartex" xmlns:cx5="http://schemas.microsoft.com/office/drawing/2016/5/11/chartex" xmlns:cx6="http://schemas.microsoft.com/office/drawing/2016/5/12/chartex" xmlns:cx7="http://schemas.microsoft.com/office/drawing/2016/5/13/chartex" xmlns:cx8="http://schemas.microsoft.com/office/drawing/2016/5/14/chartex" xmlns:mc="http://schemas.openxmlformats.org/markup-compatibility/2006" xmlns:aink="http://schemas.microsoft.com/office/drawing/2016/ink" xmlns:am3d="http://schemas.microsoft.com/office/drawing/2017/model3d" xmlns:o="urn:schemas-microsoft-com:office:office" xmlns:oel="http://schemas.microsoft.com/office/2019/extlst" xmlns:r="http://schemas.openxmlformats.org/officeDocument/2006/relationships" xmlns:m="http://schemas.openxmlformats.org/officeDocument/2006/math" xmlns:v="urn:schemas-microsoft-com:vml" xmlns:wp14="http://schemas.microsoft.com/office/word/2010/wordprocessingDrawing" xmlns:wp="http://schemas.openxmlformats.org/drawingml/2006/wordprocessingDrawing" xmlns:w10="urn:schemas-microsoft-com:office:word" xmlns:w="http://schemas.openxmlformats.org/wordprocessingml/2006/main" xmlns:w14="http://schemas.microsoft.com/office/word/2010/wordml" xmlns:w15="http://schemas.microsoft.com/office/word/2012/wordml" xmlns:w16cex="http://schemas.microsoft.com/office/word/2018/wordml/cex" xmlns:w16cid="http://schemas.microsoft.com/office/word/2016/wordml/cid" xmlns:w16="http://schemas.microsoft.com/office/word/2018/wordml" xmlns:w16du="http://schemas.microsoft.com/office/word/2023/wordml/word16du" xmlns:w16sdtdh="http://schemas.microsoft.com/office/word/2020/wordml/sdtdatahash" xmlns:w16sdtfl="http://schemas.microsoft.com/office/word/2024/wordml/sdtformatlock" xmlns:w16se="http://schemas.microsoft.com/office/word/2015/wordml/symex" xmlns:wpg="http://schemas.microsoft.com/office/word/2010/wordprocessingGroup" xmlns:wpi="http://schemas.microsoft.com/office/word/2010/wordprocessingInk" xmlns:wne="http://schemas.microsoft.com/office/word/2006/wordml" xmlns:wps="http://schemas.microsoft.com/office/word/2010/wordprocessingShape" xmlns:a="http://schemas.openxmlformats.org/drawingml/2006/main" xmlns:pic="http://schemas.openxmlformats.org/drawingml/2006/picture" xmlns:a14="http://schemas.microsoft.com/office/drawing/2010/main" mc:Ignorable="w14 w15 w16se w16cid w16 w16cex w16sdtdh w16sdtfl w16du wp14">
   <w:body>
     <w:p>
       <w:pPr>
@@ -102,53 +102,13 @@
     </w:p>
     <w:p>
       <w:pPr>
+        <w:pStyle w:val="Normal"/>
         <w:tabs>
           <w:tab w:val="left" w:pos="1196"/>
         </w:tabs>
-        <w:rPr>
-          <w:rFonts w:ascii="Arial" w:hAnsi="Arial" w:cs="Arial"/>
-        </w:rPr>
-      </w:pPr>
-      <w:r>
-        <w:rPr>
-          <w:rFonts w:ascii="Arial" w:hAnsi="Arial" w:cs="Arial"/>
-        </w:rPr>
-        <w:tab/>
-      </w:r>
-    </w:p>
-    <w:p>
-      <w:pPr>
-        <w:tabs>
-          <w:tab w:val="left" w:pos="1196"/>
-        </w:tabs>
-        <w:rPr>
-          <w:rFonts w:ascii="Arial" w:hAnsi="Arial" w:cs="Arial"/>
-        </w:rPr>
-      </w:pPr>
-    </w:p>
-    <w:p>
-      <w:pPr>
-        <w:tabs>
-          <w:tab w:val="left" w:pos="1196"/>
-        </w:tabs>
-        <w:rPr>
-          <w:rFonts w:ascii="Arial" w:hAnsi="Arial" w:cs="Arial"/>
-        </w:rPr>
-      </w:pPr>
-    </w:p>
-    <w:p>
-      <w:pPr>
-        <w:tabs>
-          <w:tab w:val="left" w:pos="1196"/>
-        </w:tabs>
-        <w:rPr>
-          <w:rFonts w:ascii="Arial" w:hAnsi="Arial" w:cs="Arial"/>
-          <w:b/>
-          <w:bCs/>
-          <w:i/>
-          <w:iCs/>
-          <w:sz w:val="32"/>
-          <w:szCs w:val="32"/>
+        <w:ind w:firstLine="0"/>
+        <w:rPr>
+          <w:rFonts w:ascii="Arial" w:hAnsi="Arial" w:cs="Arial"/>
         </w:rPr>
       </w:pPr>
     </w:p>
@@ -781,6 +741,16 @@
     <w:p>
       <w:pPr>
         <w:tabs>
+          <w:tab w:val="left" w:leader="none" w:pos="1196"/>
+        </w:tabs>
+        <w:rPr>
+          <w:rFonts w:ascii="Arial" w:hAnsi="Arial" w:cs="Arial"/>
+        </w:rPr>
+      </w:pPr>
+    </w:p>
+    <w:p>
+      <w:pPr>
+        <w:tabs>
           <w:tab w:val="left" w:pos="1196"/>
         </w:tabs>
         <w:rPr>
@@ -825,22 +795,14 @@
         <w:rPr>
           <w:rFonts w:ascii="Arial" w:hAnsi="Arial" w:cs="Arial"/>
         </w:rPr>
-        <w:t xml:space="preserve">Anyone can see posts you </w:t>
-      </w:r>
-      <w:r>
-        <w:rPr>
-          <w:rFonts w:ascii="Arial" w:hAnsi="Arial" w:cs="Arial"/>
-        </w:rPr>
-        <w:t xml:space="preserve">upload; </w:t>
-      </w:r>
-      <w:proofErr w:type="gramStart"/>
-      <w:r>
-        <w:rPr>
-          <w:rFonts w:ascii="Arial" w:hAnsi="Arial" w:cs="Arial"/>
-        </w:rPr>
-        <w:t>therefore</w:t>
-      </w:r>
-      <w:proofErr w:type="gramEnd"/>
+        <w:t xml:space="preserve">Anyone can see posts you upload; </w:t>
+      </w:r>
+      <w:r>
+        <w:rPr>
+          <w:rFonts w:ascii="Arial" w:hAnsi="Arial" w:cs="Arial"/>
+        </w:rPr>
+        <w:t>therefore,</w:t>
+      </w:r>
       <w:r>
         <w:rPr>
           <w:rFonts w:ascii="Arial" w:hAnsi="Arial" w:cs="Arial"/>
@@ -1039,8 +1001,8 @@
       <w:r>
         <w:rPr>
           <w:rFonts w:ascii="Arial" w:hAnsi="Arial" w:cs="Arial"/>
-          <w:b/>
-          <w:bCs/>
+          <w:b w:val="1"/>
+          <w:bCs w:val="1"/>
         </w:rPr>
         <w:t>Notifications</w:t>
       </w:r>
@@ -1048,31 +1010,31 @@
         <w:rPr>
           <w:rFonts w:ascii="Arial" w:hAnsi="Arial" w:cs="Arial"/>
         </w:rPr>
-        <w:t xml:space="preserve">: We use this to tell you important information regarding the app, including </w:t>
-      </w:r>
-      <w:r>
-        <w:rPr>
-          <w:rFonts w:ascii="Arial" w:hAnsi="Arial" w:cs="Arial"/>
-        </w:rPr>
-        <w:t xml:space="preserve">whether your reserved item is ready to be picked up or </w:t>
-      </w:r>
-      <w:r>
-        <w:rPr>
-          <w:rFonts w:ascii="Arial" w:hAnsi="Arial" w:cs="Arial"/>
-        </w:rPr>
-        <w:t xml:space="preserve">reminders of how long </w:t>
-      </w:r>
-      <w:r>
-        <w:rPr>
-          <w:rFonts w:ascii="Arial" w:hAnsi="Arial" w:cs="Arial"/>
-        </w:rPr>
-        <w:t>is left to pick up an item. If you are a store account, notifications are used to alert</w:t>
-      </w:r>
-      <w:r>
-        <w:rPr>
-          <w:rFonts w:ascii="Arial" w:hAnsi="Arial" w:cs="Arial"/>
-        </w:rPr>
-        <w:t xml:space="preserve"> to when and which items have been reserved.</w:t>
+        <w:t xml:space="preserve">: We use this to tell you </w:t>
+      </w:r>
+      <w:r>
+        <w:rPr>
+          <w:rFonts w:ascii="Arial" w:hAnsi="Arial" w:cs="Arial"/>
+        </w:rPr>
+        <w:t>important information</w:t>
+      </w:r>
+      <w:r>
+        <w:rPr>
+          <w:rFonts w:ascii="Arial" w:hAnsi="Arial" w:cs="Arial"/>
+        </w:rPr>
+        <w:t xml:space="preserve"> </w:t>
+      </w:r>
+      <w:r>
+        <w:rPr>
+          <w:rFonts w:ascii="Arial" w:hAnsi="Arial" w:cs="Arial"/>
+        </w:rPr>
+        <w:t>regarding</w:t>
+      </w:r>
+      <w:r>
+        <w:rPr>
+          <w:rFonts w:ascii="Arial" w:hAnsi="Arial" w:cs="Arial"/>
+        </w:rPr>
+        <w:t xml:space="preserve"> the app, including whether your reserved item is ready to be picked up or reminders of how long is left to pick up an item. If you are a store account, notifications are used to alert to when and which items have been reserved. You can turn these off at any time in your device settings.</w:t>
       </w:r>
     </w:p>
     <w:p>
@@ -1251,7 +1213,7 @@
     </w:p>
     <w:sectPr>
       <w:footerReference w:type="default" r:id="rId8"/>
-      <w:pgSz w:w="11906" w:h="16838"/>
+      <w:pgSz w:w="11906" w:h="16838" w:orient="portrait"/>
       <w:pgMar w:top="1440" w:right="1440" w:bottom="1440" w:left="1440" w:header="708" w:footer="708" w:gutter="0"/>
       <w:cols w:space="708"/>
       <w:docGrid w:linePitch="360"/>
@@ -1286,7 +1248,7 @@
 </file>
 
 <file path=word/footer1.xml><?xml version="1.0" encoding="utf-8"?>
-<w:ftr xmlns:wpc="http://schemas.microsoft.com/office/word/2010/wordprocessingCanvas" xmlns:cx="http://schemas.microsoft.com/office/drawing/2014/chartex" xmlns:cx1="http://schemas.microsoft.com/office/drawing/2015/9/8/chartex" xmlns:cx2="http://schemas.microsoft.com/office/drawing/2015/10/21/chartex" xmlns:cx3="http://schemas.microsoft.com/office/drawing/2016/5/9/chartex" xmlns:cx4="http://schemas.microsoft.com/office/drawing/2016/5/10/chartex" xmlns:cx5="http://schemas.microsoft.com/office/drawing/2016/5/11/chartex" xmlns:cx6="http://schemas.microsoft.com/office/drawing/2016/5/12/chartex" xmlns:cx7="http://schemas.microsoft.com/office/drawing/2016/5/13/chartex" xmlns:cx8="http://schemas.microsoft.com/office/drawing/2016/5/14/chartex" xmlns:mc="http://schemas.openxmlformats.org/markup-compatibility/2006" xmlns:aink="http://schemas.microsoft.com/office/drawing/2016/ink" xmlns:am3d="http://schemas.microsoft.com/office/drawing/2017/model3d" xmlns:o="urn:schemas-microsoft-com:office:office" xmlns:oel="http://schemas.microsoft.com/office/2019/extlst" xmlns:r="http://schemas.openxmlformats.org/officeDocument/2006/relationships" xmlns:m="http://schemas.openxmlformats.org/officeDocument/2006/math" xmlns:v="urn:schemas-microsoft-com:vml" xmlns:wp14="http://schemas.microsoft.com/office/word/2010/wordprocessingDrawing" xmlns:wp="http://schemas.openxmlformats.org/drawingml/2006/wordprocessingDrawing" xmlns:w10="urn:schemas-microsoft-com:office:word" xmlns:w="http://schemas.openxmlformats.org/wordprocessingml/2006/main" xmlns:w14="http://schemas.microsoft.com/office/word/2010/wordml" xmlns:w15="http://schemas.microsoft.com/office/word/2012/wordml" xmlns:w16cex="http://schemas.microsoft.com/office/word/2018/wordml/cex" xmlns:w16cid="http://schemas.microsoft.com/office/word/2016/wordml/cid" xmlns:w16="http://schemas.microsoft.com/office/word/2018/wordml" xmlns:w16du="http://schemas.microsoft.com/office/word/2023/wordml/word16du" xmlns:w16sdtdh="http://schemas.microsoft.com/office/word/2020/wordml/sdtdatahash" xmlns:w16sdtfl="http://schemas.microsoft.com/office/word/2024/wordml/sdtformatlock" xmlns:w16se="http://schemas.microsoft.com/office/word/2015/wordml/symex" xmlns:wpg="http://schemas.microsoft.com/office/word/2010/wordprocessingGroup" xmlns:wpi="http://schemas.microsoft.com/office/word/2010/wordprocessingInk" xmlns:wne="http://schemas.microsoft.com/office/word/2006/wordml" xmlns:wps="http://schemas.microsoft.com/office/word/2010/wordprocessingShape" mc:Ignorable="w14 w15 w16se w16cid w16 w16cex w16sdtdh w16sdtfl w16du wp14">
+<w:ftr xmlns:wpc="http://schemas.microsoft.com/office/word/2010/wordprocessingCanvas" xmlns:cx="http://schemas.microsoft.com/office/drawing/2014/chartex" xmlns:cx1="http://schemas.microsoft.com/office/drawing/2015/9/8/chartex" xmlns:cx2="http://schemas.microsoft.com/office/drawing/2015/10/21/chartex" xmlns:cx3="http://schemas.microsoft.com/office/drawing/2016/5/9/chartex" xmlns:cx4="http://schemas.microsoft.com/office/drawing/2016/5/10/chartex" xmlns:cx5="http://schemas.microsoft.com/office/drawing/2016/5/11/chartex" xmlns:cx6="http://schemas.microsoft.com/office/drawing/2016/5/12/chartex" xmlns:cx7="http://schemas.microsoft.com/office/drawing/2016/5/13/chartex" xmlns:cx8="http://schemas.microsoft.com/office/drawing/2016/5/14/chartex" xmlns:mc="http://schemas.openxmlformats.org/markup-compatibility/2006" xmlns:aink="http://schemas.microsoft.com/office/drawing/2016/ink" xmlns:am3d="http://schemas.microsoft.com/office/drawing/2017/model3d" xmlns:o="urn:schemas-microsoft-com:office:office" xmlns:oel="http://schemas.microsoft.com/office/2019/extlst" xmlns:r="http://schemas.openxmlformats.org/officeDocument/2006/relationships" xmlns:m="http://schemas.openxmlformats.org/officeDocument/2006/math" xmlns:v="urn:schemas-microsoft-com:vml" xmlns:wp14="http://schemas.microsoft.com/office/word/2010/wordprocessingDrawing" xmlns:wp="http://schemas.openxmlformats.org/drawingml/2006/wordprocessingDrawing" xmlns:w10="urn:schemas-microsoft-com:office:word" xmlns:w="http://schemas.openxmlformats.org/wordprocessingml/2006/main" xmlns:w14="http://schemas.microsoft.com/office/word/2010/wordml" xmlns:w15="http://schemas.microsoft.com/office/word/2012/wordml" xmlns:w16cex="http://schemas.microsoft.com/office/word/2018/wordml/cex" xmlns:w16cid="http://schemas.microsoft.com/office/word/2016/wordml/cid" xmlns:w16="http://schemas.microsoft.com/office/word/2018/wordml" xmlns:w16du="http://schemas.microsoft.com/office/word/2023/wordml/word16du" xmlns:w16sdtdh="http://schemas.microsoft.com/office/word/2020/wordml/sdtdatahash" xmlns:w16sdtfl="http://schemas.microsoft.com/office/word/2024/wordml/sdtformatlock" xmlns:w16se="http://schemas.microsoft.com/office/word/2015/wordml/symex" xmlns:wpg="http://schemas.microsoft.com/office/word/2010/wordprocessingGroup" xmlns:wpi="http://schemas.microsoft.com/office/word/2010/wordprocessingInk" xmlns:wne="http://schemas.microsoft.com/office/word/2006/wordml" xmlns:wps="http://schemas.microsoft.com/office/word/2010/wordprocessingShape" xmlns:a="http://schemas.openxmlformats.org/drawingml/2006/main" xmlns:pic="http://schemas.openxmlformats.org/drawingml/2006/picture" xmlns:a14="http://schemas.microsoft.com/office/drawing/2010/main" mc:Ignorable="w14 w15 w16se w16cid w16 w16cex w16sdtdh w16sdtfl w16du wp14">
   <w:p>
     <w:pPr>
       <w:pStyle w:val="Footer"/>
@@ -1417,7 +1379,7 @@
         <w:ind w:left="720" w:hanging="360"/>
       </w:pPr>
       <w:rPr>
-        <w:rFonts w:ascii="Symbol" w:hAnsi="Symbol" w:hint="default"/>
+        <w:rFonts w:hint="default" w:ascii="Symbol" w:hAnsi="Symbol"/>
       </w:rPr>
     </w:lvl>
     <w:lvl w:ilvl="1" w:tplc="08090003" w:tentative="1">
@@ -1429,7 +1391,7 @@
         <w:ind w:left="1440" w:hanging="360"/>
       </w:pPr>
       <w:rPr>
-        <w:rFonts w:ascii="Courier New" w:hAnsi="Courier New" w:cs="Courier New" w:hint="default"/>
+        <w:rFonts w:hint="default" w:ascii="Courier New" w:hAnsi="Courier New" w:cs="Courier New"/>
       </w:rPr>
     </w:lvl>
     <w:lvl w:ilvl="2" w:tplc="08090005" w:tentative="1">
@@ -1441,7 +1403,7 @@
         <w:ind w:left="2160" w:hanging="360"/>
       </w:pPr>
       <w:rPr>
-        <w:rFonts w:ascii="Wingdings" w:hAnsi="Wingdings" w:hint="default"/>
+        <w:rFonts w:hint="default" w:ascii="Wingdings" w:hAnsi="Wingdings"/>
       </w:rPr>
     </w:lvl>
     <w:lvl w:ilvl="3" w:tplc="08090001" w:tentative="1">
@@ -1453,7 +1415,7 @@
         <w:ind w:left="2880" w:hanging="360"/>
       </w:pPr>
       <w:rPr>
-        <w:rFonts w:ascii="Symbol" w:hAnsi="Symbol" w:hint="default"/>
+        <w:rFonts w:hint="default" w:ascii="Symbol" w:hAnsi="Symbol"/>
       </w:rPr>
     </w:lvl>
     <w:lvl w:ilvl="4" w:tplc="08090003" w:tentative="1">
@@ -1465,7 +1427,7 @@
         <w:ind w:left="3600" w:hanging="360"/>
       </w:pPr>
       <w:rPr>
-        <w:rFonts w:ascii="Courier New" w:hAnsi="Courier New" w:cs="Courier New" w:hint="default"/>
+        <w:rFonts w:hint="default" w:ascii="Courier New" w:hAnsi="Courier New" w:cs="Courier New"/>
       </w:rPr>
     </w:lvl>
     <w:lvl w:ilvl="5" w:tplc="08090005" w:tentative="1">
@@ -1477,7 +1439,7 @@
         <w:ind w:left="4320" w:hanging="360"/>
       </w:pPr>
       <w:rPr>
-        <w:rFonts w:ascii="Wingdings" w:hAnsi="Wingdings" w:hint="default"/>
+        <w:rFonts w:hint="default" w:ascii="Wingdings" w:hAnsi="Wingdings"/>
       </w:rPr>
     </w:lvl>
     <w:lvl w:ilvl="6" w:tplc="08090001" w:tentative="1">
@@ -1489,7 +1451,7 @@
         <w:ind w:left="5040" w:hanging="360"/>
       </w:pPr>
       <w:rPr>
-        <w:rFonts w:ascii="Symbol" w:hAnsi="Symbol" w:hint="default"/>
+        <w:rFonts w:hint="default" w:ascii="Symbol" w:hAnsi="Symbol"/>
       </w:rPr>
     </w:lvl>
     <w:lvl w:ilvl="7" w:tplc="08090003" w:tentative="1">
@@ -1501,7 +1463,7 @@
         <w:ind w:left="5760" w:hanging="360"/>
       </w:pPr>
       <w:rPr>
-        <w:rFonts w:ascii="Courier New" w:hAnsi="Courier New" w:cs="Courier New" w:hint="default"/>
+        <w:rFonts w:hint="default" w:ascii="Courier New" w:hAnsi="Courier New" w:cs="Courier New"/>
       </w:rPr>
     </w:lvl>
     <w:lvl w:ilvl="8" w:tplc="08090005" w:tentative="1">
@@ -1513,7 +1475,7 @@
         <w:ind w:left="6480" w:hanging="360"/>
       </w:pPr>
       <w:rPr>
-        <w:rFonts w:ascii="Wingdings" w:hAnsi="Wingdings" w:hint="default"/>
+        <w:rFonts w:hint="default" w:ascii="Wingdings" w:hAnsi="Wingdings"/>
       </w:rPr>
     </w:lvl>
   </w:abstractNum>
@@ -1530,7 +1492,7 @@
         <w:ind w:left="720" w:hanging="360"/>
       </w:pPr>
       <w:rPr>
-        <w:rFonts w:ascii="Arial" w:eastAsiaTheme="minorHAnsi" w:hAnsi="Arial" w:cs="Arial" w:hint="default"/>
+        <w:rFonts w:hint="default" w:ascii="Arial" w:hAnsi="Arial" w:cs="Arial" w:eastAsiaTheme="minorHAnsi"/>
       </w:rPr>
     </w:lvl>
     <w:lvl w:ilvl="1" w:tplc="08090003" w:tentative="1">
@@ -1542,7 +1504,7 @@
         <w:ind w:left="1440" w:hanging="360"/>
       </w:pPr>
       <w:rPr>
-        <w:rFonts w:ascii="Courier New" w:hAnsi="Courier New" w:cs="Courier New" w:hint="default"/>
+        <w:rFonts w:hint="default" w:ascii="Courier New" w:hAnsi="Courier New" w:cs="Courier New"/>
       </w:rPr>
     </w:lvl>
     <w:lvl w:ilvl="2" w:tplc="08090005" w:tentative="1">
@@ -1554,7 +1516,7 @@
         <w:ind w:left="2160" w:hanging="360"/>
       </w:pPr>
       <w:rPr>
-        <w:rFonts w:ascii="Wingdings" w:hAnsi="Wingdings" w:hint="default"/>
+        <w:rFonts w:hint="default" w:ascii="Wingdings" w:hAnsi="Wingdings"/>
       </w:rPr>
     </w:lvl>
     <w:lvl w:ilvl="3" w:tplc="08090001" w:tentative="1">
@@ -1566,7 +1528,7 @@
         <w:ind w:left="2880" w:hanging="360"/>
       </w:pPr>
       <w:rPr>
-        <w:rFonts w:ascii="Symbol" w:hAnsi="Symbol" w:hint="default"/>
+        <w:rFonts w:hint="default" w:ascii="Symbol" w:hAnsi="Symbol"/>
       </w:rPr>
     </w:lvl>
     <w:lvl w:ilvl="4" w:tplc="08090003" w:tentative="1">
@@ -1578,7 +1540,7 @@
         <w:ind w:left="3600" w:hanging="360"/>
       </w:pPr>
       <w:rPr>
-        <w:rFonts w:ascii="Courier New" w:hAnsi="Courier New" w:cs="Courier New" w:hint="default"/>
+        <w:rFonts w:hint="default" w:ascii="Courier New" w:hAnsi="Courier New" w:cs="Courier New"/>
       </w:rPr>
     </w:lvl>
     <w:lvl w:ilvl="5" w:tplc="08090005" w:tentative="1">
@@ -1590,7 +1552,7 @@
         <w:ind w:left="4320" w:hanging="360"/>
       </w:pPr>
       <w:rPr>
-        <w:rFonts w:ascii="Wingdings" w:hAnsi="Wingdings" w:hint="default"/>
+        <w:rFonts w:hint="default" w:ascii="Wingdings" w:hAnsi="Wingdings"/>
       </w:rPr>
     </w:lvl>
     <w:lvl w:ilvl="6" w:tplc="08090001" w:tentative="1">
@@ -1602,7 +1564,7 @@
         <w:ind w:left="5040" w:hanging="360"/>
       </w:pPr>
       <w:rPr>
-        <w:rFonts w:ascii="Symbol" w:hAnsi="Symbol" w:hint="default"/>
+        <w:rFonts w:hint="default" w:ascii="Symbol" w:hAnsi="Symbol"/>
       </w:rPr>
     </w:lvl>
     <w:lvl w:ilvl="7" w:tplc="08090003" w:tentative="1">
@@ -1614,7 +1576,7 @@
         <w:ind w:left="5760" w:hanging="360"/>
       </w:pPr>
       <w:rPr>
-        <w:rFonts w:ascii="Courier New" w:hAnsi="Courier New" w:cs="Courier New" w:hint="default"/>
+        <w:rFonts w:hint="default" w:ascii="Courier New" w:hAnsi="Courier New" w:cs="Courier New"/>
       </w:rPr>
     </w:lvl>
     <w:lvl w:ilvl="8" w:tplc="08090005" w:tentative="1">
@@ -1626,7 +1588,7 @@
         <w:ind w:left="6480" w:hanging="360"/>
       </w:pPr>
       <w:rPr>
-        <w:rFonts w:ascii="Wingdings" w:hAnsi="Wingdings" w:hint="default"/>
+        <w:rFonts w:hint="default" w:ascii="Wingdings" w:hAnsi="Wingdings"/>
       </w:rPr>
     </w:lvl>
   </w:abstractNum>
@@ -1732,7 +1694,7 @@
         <w:ind w:left="1080" w:hanging="360"/>
       </w:pPr>
       <w:rPr>
-        <w:rFonts w:ascii="Symbol" w:hAnsi="Symbol" w:hint="default"/>
+        <w:rFonts w:hint="default" w:ascii="Symbol" w:hAnsi="Symbol"/>
       </w:rPr>
     </w:lvl>
     <w:lvl w:ilvl="1" w:tplc="08090003" w:tentative="1">
@@ -1744,7 +1706,7 @@
         <w:ind w:left="1800" w:hanging="360"/>
       </w:pPr>
       <w:rPr>
-        <w:rFonts w:ascii="Courier New" w:hAnsi="Courier New" w:cs="Courier New" w:hint="default"/>
+        <w:rFonts w:hint="default" w:ascii="Courier New" w:hAnsi="Courier New" w:cs="Courier New"/>
       </w:rPr>
     </w:lvl>
     <w:lvl w:ilvl="2" w:tplc="08090005" w:tentative="1">
@@ -1756,7 +1718,7 @@
         <w:ind w:left="2520" w:hanging="360"/>
       </w:pPr>
       <w:rPr>
-        <w:rFonts w:ascii="Wingdings" w:hAnsi="Wingdings" w:hint="default"/>
+        <w:rFonts w:hint="default" w:ascii="Wingdings" w:hAnsi="Wingdings"/>
       </w:rPr>
     </w:lvl>
     <w:lvl w:ilvl="3" w:tplc="08090001" w:tentative="1">
@@ -1768,7 +1730,7 @@
         <w:ind w:left="3240" w:hanging="360"/>
       </w:pPr>
       <w:rPr>
-        <w:rFonts w:ascii="Symbol" w:hAnsi="Symbol" w:hint="default"/>
+        <w:rFonts w:hint="default" w:ascii="Symbol" w:hAnsi="Symbol"/>
       </w:rPr>
     </w:lvl>
     <w:lvl w:ilvl="4" w:tplc="08090003" w:tentative="1">
@@ -1780,7 +1742,7 @@
         <w:ind w:left="3960" w:hanging="360"/>
       </w:pPr>
       <w:rPr>
-        <w:rFonts w:ascii="Courier New" w:hAnsi="Courier New" w:cs="Courier New" w:hint="default"/>
+        <w:rFonts w:hint="default" w:ascii="Courier New" w:hAnsi="Courier New" w:cs="Courier New"/>
       </w:rPr>
     </w:lvl>
     <w:lvl w:ilvl="5" w:tplc="08090005" w:tentative="1">
@@ -1792,7 +1754,7 @@
         <w:ind w:left="4680" w:hanging="360"/>
       </w:pPr>
       <w:rPr>
-        <w:rFonts w:ascii="Wingdings" w:hAnsi="Wingdings" w:hint="default"/>
+        <w:rFonts w:hint="default" w:ascii="Wingdings" w:hAnsi="Wingdings"/>
       </w:rPr>
     </w:lvl>
     <w:lvl w:ilvl="6" w:tplc="08090001" w:tentative="1">
@@ -1804,7 +1766,7 @@
         <w:ind w:left="5400" w:hanging="360"/>
       </w:pPr>
       <w:rPr>
-        <w:rFonts w:ascii="Symbol" w:hAnsi="Symbol" w:hint="default"/>
+        <w:rFonts w:hint="default" w:ascii="Symbol" w:hAnsi="Symbol"/>
       </w:rPr>
     </w:lvl>
     <w:lvl w:ilvl="7" w:tplc="08090003" w:tentative="1">
@@ -1816,7 +1778,7 @@
         <w:ind w:left="6120" w:hanging="360"/>
       </w:pPr>
       <w:rPr>
-        <w:rFonts w:ascii="Courier New" w:hAnsi="Courier New" w:cs="Courier New" w:hint="default"/>
+        <w:rFonts w:hint="default" w:ascii="Courier New" w:hAnsi="Courier New" w:cs="Courier New"/>
       </w:rPr>
     </w:lvl>
     <w:lvl w:ilvl="8" w:tplc="08090005" w:tentative="1">
@@ -1828,7 +1790,7 @@
         <w:ind w:left="6840" w:hanging="360"/>
       </w:pPr>
       <w:rPr>
-        <w:rFonts w:ascii="Wingdings" w:hAnsi="Wingdings" w:hint="default"/>
+        <w:rFonts w:hint="default" w:ascii="Wingdings" w:hAnsi="Wingdings"/>
       </w:rPr>
     </w:lvl>
   </w:abstractNum>
@@ -1845,7 +1807,7 @@
         <w:ind w:left="720" w:hanging="360"/>
       </w:pPr>
       <w:rPr>
-        <w:rFonts w:ascii="Symbol" w:hAnsi="Symbol" w:hint="default"/>
+        <w:rFonts w:hint="default" w:ascii="Symbol" w:hAnsi="Symbol"/>
       </w:rPr>
     </w:lvl>
     <w:lvl w:ilvl="1" w:tplc="FFFFFFFF" w:tentative="1">
@@ -1857,7 +1819,7 @@
         <w:ind w:left="1440" w:hanging="360"/>
       </w:pPr>
       <w:rPr>
-        <w:rFonts w:ascii="Courier New" w:hAnsi="Courier New" w:cs="Courier New" w:hint="default"/>
+        <w:rFonts w:hint="default" w:ascii="Courier New" w:hAnsi="Courier New" w:cs="Courier New"/>
       </w:rPr>
     </w:lvl>
     <w:lvl w:ilvl="2" w:tplc="FFFFFFFF" w:tentative="1">
@@ -1869,7 +1831,7 @@
         <w:ind w:left="2160" w:hanging="360"/>
       </w:pPr>
       <w:rPr>
-        <w:rFonts w:ascii="Wingdings" w:hAnsi="Wingdings" w:hint="default"/>
+        <w:rFonts w:hint="default" w:ascii="Wingdings" w:hAnsi="Wingdings"/>
       </w:rPr>
     </w:lvl>
     <w:lvl w:ilvl="3" w:tplc="FFFFFFFF" w:tentative="1">
@@ -1881,7 +1843,7 @@
         <w:ind w:left="2880" w:hanging="360"/>
       </w:pPr>
       <w:rPr>
-        <w:rFonts w:ascii="Symbol" w:hAnsi="Symbol" w:hint="default"/>
+        <w:rFonts w:hint="default" w:ascii="Symbol" w:hAnsi="Symbol"/>
       </w:rPr>
     </w:lvl>
     <w:lvl w:ilvl="4" w:tplc="FFFFFFFF" w:tentative="1">
@@ -1893,7 +1855,7 @@
         <w:ind w:left="3600" w:hanging="360"/>
       </w:pPr>
       <w:rPr>
-        <w:rFonts w:ascii="Courier New" w:hAnsi="Courier New" w:cs="Courier New" w:hint="default"/>
+        <w:rFonts w:hint="default" w:ascii="Courier New" w:hAnsi="Courier New" w:cs="Courier New"/>
       </w:rPr>
     </w:lvl>
     <w:lvl w:ilvl="5" w:tplc="FFFFFFFF" w:tentative="1">
@@ -1905,7 +1867,7 @@
         <w:ind w:left="4320" w:hanging="360"/>
       </w:pPr>
       <w:rPr>
-        <w:rFonts w:ascii="Wingdings" w:hAnsi="Wingdings" w:hint="default"/>
+        <w:rFonts w:hint="default" w:ascii="Wingdings" w:hAnsi="Wingdings"/>
       </w:rPr>
     </w:lvl>
     <w:lvl w:ilvl="6" w:tplc="FFFFFFFF" w:tentative="1">
@@ -1917,7 +1879,7 @@
         <w:ind w:left="5040" w:hanging="360"/>
       </w:pPr>
       <w:rPr>
-        <w:rFonts w:ascii="Symbol" w:hAnsi="Symbol" w:hint="default"/>
+        <w:rFonts w:hint="default" w:ascii="Symbol" w:hAnsi="Symbol"/>
       </w:rPr>
     </w:lvl>
     <w:lvl w:ilvl="7" w:tplc="FFFFFFFF" w:tentative="1">
@@ -1929,7 +1891,7 @@
         <w:ind w:left="5760" w:hanging="360"/>
       </w:pPr>
       <w:rPr>
-        <w:rFonts w:ascii="Courier New" w:hAnsi="Courier New" w:cs="Courier New" w:hint="default"/>
+        <w:rFonts w:hint="default" w:ascii="Courier New" w:hAnsi="Courier New" w:cs="Courier New"/>
       </w:rPr>
     </w:lvl>
     <w:lvl w:ilvl="8" w:tplc="FFFFFFFF" w:tentative="1">
@@ -1941,7 +1903,7 @@
         <w:ind w:left="6480" w:hanging="360"/>
       </w:pPr>
       <w:rPr>
-        <w:rFonts w:ascii="Wingdings" w:hAnsi="Wingdings" w:hint="default"/>
+        <w:rFonts w:hint="default" w:ascii="Wingdings" w:hAnsi="Wingdings"/>
       </w:rPr>
     </w:lvl>
   </w:abstractNum>
@@ -1958,7 +1920,7 @@
         <w:ind w:left="720" w:hanging="360"/>
       </w:pPr>
       <w:rPr>
-        <w:rFonts w:ascii="Arial" w:eastAsiaTheme="minorHAnsi" w:hAnsi="Arial" w:cs="Arial" w:hint="default"/>
+        <w:rFonts w:hint="default" w:ascii="Arial" w:hAnsi="Arial" w:cs="Arial" w:eastAsiaTheme="minorHAnsi"/>
       </w:rPr>
     </w:lvl>
     <w:lvl w:ilvl="1" w:tplc="08090003" w:tentative="1">
@@ -1970,7 +1932,7 @@
         <w:ind w:left="1440" w:hanging="360"/>
       </w:pPr>
       <w:rPr>
-        <w:rFonts w:ascii="Courier New" w:hAnsi="Courier New" w:cs="Courier New" w:hint="default"/>
+        <w:rFonts w:hint="default" w:ascii="Courier New" w:hAnsi="Courier New" w:cs="Courier New"/>
       </w:rPr>
     </w:lvl>
     <w:lvl w:ilvl="2" w:tplc="08090005" w:tentative="1">
@@ -1982,7 +1944,7 @@
         <w:ind w:left="2160" w:hanging="360"/>
       </w:pPr>
       <w:rPr>
-        <w:rFonts w:ascii="Wingdings" w:hAnsi="Wingdings" w:hint="default"/>
+        <w:rFonts w:hint="default" w:ascii="Wingdings" w:hAnsi="Wingdings"/>
       </w:rPr>
     </w:lvl>
     <w:lvl w:ilvl="3" w:tplc="08090001" w:tentative="1">
@@ -1994,7 +1956,7 @@
         <w:ind w:left="2880" w:hanging="360"/>
       </w:pPr>
       <w:rPr>
-        <w:rFonts w:ascii="Symbol" w:hAnsi="Symbol" w:hint="default"/>
+        <w:rFonts w:hint="default" w:ascii="Symbol" w:hAnsi="Symbol"/>
       </w:rPr>
     </w:lvl>
     <w:lvl w:ilvl="4" w:tplc="08090003" w:tentative="1">
@@ -2006,7 +1968,7 @@
         <w:ind w:left="3600" w:hanging="360"/>
       </w:pPr>
       <w:rPr>
-        <w:rFonts w:ascii="Courier New" w:hAnsi="Courier New" w:cs="Courier New" w:hint="default"/>
+        <w:rFonts w:hint="default" w:ascii="Courier New" w:hAnsi="Courier New" w:cs="Courier New"/>
       </w:rPr>
     </w:lvl>
     <w:lvl w:ilvl="5" w:tplc="08090005" w:tentative="1">
@@ -2018,7 +1980,7 @@
         <w:ind w:left="4320" w:hanging="360"/>
       </w:pPr>
       <w:rPr>
-        <w:rFonts w:ascii="Wingdings" w:hAnsi="Wingdings" w:hint="default"/>
+        <w:rFonts w:hint="default" w:ascii="Wingdings" w:hAnsi="Wingdings"/>
       </w:rPr>
     </w:lvl>
     <w:lvl w:ilvl="6" w:tplc="08090001" w:tentative="1">
@@ -2030,7 +1992,7 @@
         <w:ind w:left="5040" w:hanging="360"/>
       </w:pPr>
       <w:rPr>
-        <w:rFonts w:ascii="Symbol" w:hAnsi="Symbol" w:hint="default"/>
+        <w:rFonts w:hint="default" w:ascii="Symbol" w:hAnsi="Symbol"/>
       </w:rPr>
     </w:lvl>
     <w:lvl w:ilvl="7" w:tplc="08090003" w:tentative="1">
@@ -2042,7 +2004,7 @@
         <w:ind w:left="5760" w:hanging="360"/>
       </w:pPr>
       <w:rPr>
-        <w:rFonts w:ascii="Courier New" w:hAnsi="Courier New" w:cs="Courier New" w:hint="default"/>
+        <w:rFonts w:hint="default" w:ascii="Courier New" w:hAnsi="Courier New" w:cs="Courier New"/>
       </w:rPr>
     </w:lvl>
     <w:lvl w:ilvl="8" w:tplc="08090005" w:tentative="1">
@@ -2054,7 +2016,7 @@
         <w:ind w:left="6480" w:hanging="360"/>
       </w:pPr>
       <w:rPr>
-        <w:rFonts w:ascii="Wingdings" w:hAnsi="Wingdings" w:hint="default"/>
+        <w:rFonts w:hint="default" w:ascii="Wingdings" w:hAnsi="Wingdings"/>
       </w:rPr>
     </w:lvl>
   </w:abstractNum>
@@ -2084,7 +2046,7 @@
   <w:docDefaults>
     <w:rPrDefault>
       <w:rPr>
-        <w:rFonts w:asciiTheme="minorHAnsi" w:eastAsiaTheme="minorHAnsi" w:hAnsiTheme="minorHAnsi" w:cstheme="minorBidi"/>
+        <w:rFonts w:asciiTheme="minorHAnsi" w:hAnsiTheme="minorHAnsi" w:eastAsiaTheme="minorHAnsi" w:cstheme="minorBidi"/>
         <w:kern w:val="2"/>
         <w:sz w:val="22"/>
         <w:szCs w:val="22"/>
@@ -2101,14 +2063,14 @@
   <w:latentStyles w:defLockedState="0" w:defUIPriority="99" w:defSemiHidden="0" w:defUnhideWhenUsed="0" w:defQFormat="0" w:count="376">
     <w:lsdException w:name="Normal" w:uiPriority="0" w:qFormat="1"/>
     <w:lsdException w:name="heading 1" w:uiPriority="9" w:qFormat="1"/>
-    <w:lsdException w:name="heading 2" w:semiHidden="1" w:uiPriority="9" w:unhideWhenUsed="1" w:qFormat="1"/>
-    <w:lsdException w:name="heading 3" w:semiHidden="1" w:uiPriority="9" w:unhideWhenUsed="1" w:qFormat="1"/>
-    <w:lsdException w:name="heading 4" w:semiHidden="1" w:uiPriority="9" w:unhideWhenUsed="1" w:qFormat="1"/>
-    <w:lsdException w:name="heading 5" w:semiHidden="1" w:uiPriority="9" w:unhideWhenUsed="1" w:qFormat="1"/>
-    <w:lsdException w:name="heading 6" w:semiHidden="1" w:uiPriority="9" w:unhideWhenUsed="1" w:qFormat="1"/>
-    <w:lsdException w:name="heading 7" w:semiHidden="1" w:uiPriority="9" w:unhideWhenUsed="1" w:qFormat="1"/>
-    <w:lsdException w:name="heading 8" w:semiHidden="1" w:uiPriority="9" w:unhideWhenUsed="1" w:qFormat="1"/>
-    <w:lsdException w:name="heading 9" w:semiHidden="1" w:uiPriority="9" w:unhideWhenUsed="1" w:qFormat="1"/>
+    <w:lsdException w:name="heading 2" w:uiPriority="9" w:semiHidden="1" w:unhideWhenUsed="1" w:qFormat="1"/>
+    <w:lsdException w:name="heading 3" w:uiPriority="9" w:semiHidden="1" w:unhideWhenUsed="1" w:qFormat="1"/>
+    <w:lsdException w:name="heading 4" w:uiPriority="9" w:semiHidden="1" w:unhideWhenUsed="1" w:qFormat="1"/>
+    <w:lsdException w:name="heading 5" w:uiPriority="9" w:semiHidden="1" w:unhideWhenUsed="1" w:qFormat="1"/>
+    <w:lsdException w:name="heading 6" w:uiPriority="9" w:semiHidden="1" w:unhideWhenUsed="1" w:qFormat="1"/>
+    <w:lsdException w:name="heading 7" w:uiPriority="9" w:semiHidden="1" w:unhideWhenUsed="1" w:qFormat="1"/>
+    <w:lsdException w:name="heading 8" w:uiPriority="9" w:semiHidden="1" w:unhideWhenUsed="1" w:qFormat="1"/>
+    <w:lsdException w:name="heading 9" w:uiPriority="9" w:semiHidden="1" w:unhideWhenUsed="1" w:qFormat="1"/>
     <w:lsdException w:name="index 1" w:semiHidden="1" w:unhideWhenUsed="1"/>
     <w:lsdException w:name="index 2" w:semiHidden="1" w:unhideWhenUsed="1"/>
     <w:lsdException w:name="index 3" w:semiHidden="1" w:unhideWhenUsed="1"/>
@@ -2118,22 +2080,22 @@
     <w:lsdException w:name="index 7" w:semiHidden="1" w:unhideWhenUsed="1"/>
     <w:lsdException w:name="index 8" w:semiHidden="1" w:unhideWhenUsed="1"/>
     <w:lsdException w:name="index 9" w:semiHidden="1" w:unhideWhenUsed="1"/>
-    <w:lsdException w:name="toc 1" w:semiHidden="1" w:uiPriority="39" w:unhideWhenUsed="1"/>
-    <w:lsdException w:name="toc 2" w:semiHidden="1" w:uiPriority="39" w:unhideWhenUsed="1"/>
-    <w:lsdException w:name="toc 3" w:semiHidden="1" w:uiPriority="39" w:unhideWhenUsed="1"/>
-    <w:lsdException w:name="toc 4" w:semiHidden="1" w:uiPriority="39" w:unhideWhenUsed="1"/>
-    <w:lsdException w:name="toc 5" w:semiHidden="1" w:uiPriority="39" w:unhideWhenUsed="1"/>
-    <w:lsdException w:name="toc 6" w:semiHidden="1" w:uiPriority="39" w:unhideWhenUsed="1"/>
-    <w:lsdException w:name="toc 7" w:semiHidden="1" w:uiPriority="39" w:unhideWhenUsed="1"/>
-    <w:lsdException w:name="toc 8" w:semiHidden="1" w:uiPriority="39" w:unhideWhenUsed="1"/>
-    <w:lsdException w:name="toc 9" w:semiHidden="1" w:uiPriority="39" w:unhideWhenUsed="1"/>
+    <w:lsdException w:name="toc 1" w:uiPriority="39" w:semiHidden="1" w:unhideWhenUsed="1"/>
+    <w:lsdException w:name="toc 2" w:uiPriority="39" w:semiHidden="1" w:unhideWhenUsed="1"/>
+    <w:lsdException w:name="toc 3" w:uiPriority="39" w:semiHidden="1" w:unhideWhenUsed="1"/>
+    <w:lsdException w:name="toc 4" w:uiPriority="39" w:semiHidden="1" w:unhideWhenUsed="1"/>
+    <w:lsdException w:name="toc 5" w:uiPriority="39" w:semiHidden="1" w:unhideWhenUsed="1"/>
+    <w:lsdException w:name="toc 6" w:uiPriority="39" w:semiHidden="1" w:unhideWhenUsed="1"/>
+    <w:lsdException w:name="toc 7" w:uiPriority="39" w:semiHidden="1" w:unhideWhenUsed="1"/>
+    <w:lsdException w:name="toc 8" w:uiPriority="39" w:semiHidden="1" w:unhideWhenUsed="1"/>
+    <w:lsdException w:name="toc 9" w:uiPriority="39" w:semiHidden="1" w:unhideWhenUsed="1"/>
     <w:lsdException w:name="Normal Indent" w:semiHidden="1" w:unhideWhenUsed="1"/>
     <w:lsdException w:name="footnote text" w:semiHidden="1" w:unhideWhenUsed="1"/>
     <w:lsdException w:name="annotation text" w:semiHidden="1" w:unhideWhenUsed="1"/>
     <w:lsdException w:name="header" w:semiHidden="1" w:unhideWhenUsed="1"/>
     <w:lsdException w:name="footer" w:semiHidden="1" w:unhideWhenUsed="1"/>
     <w:lsdException w:name="index heading" w:semiHidden="1" w:unhideWhenUsed="1"/>
-    <w:lsdException w:name="caption" w:semiHidden="1" w:uiPriority="35" w:unhideWhenUsed="1" w:qFormat="1"/>
+    <w:lsdException w:name="caption" w:uiPriority="35" w:semiHidden="1" w:unhideWhenUsed="1" w:qFormat="1"/>
     <w:lsdException w:name="table of figures" w:semiHidden="1" w:unhideWhenUsed="1"/>
     <w:lsdException w:name="envelope address" w:semiHidden="1" w:unhideWhenUsed="1"/>
     <w:lsdException w:name="envelope return" w:semiHidden="1" w:unhideWhenUsed="1"/>
@@ -2164,7 +2126,7 @@
     <w:lsdException w:name="Title" w:uiPriority="10" w:qFormat="1"/>
     <w:lsdException w:name="Closing" w:semiHidden="1" w:unhideWhenUsed="1"/>
     <w:lsdException w:name="Signature" w:semiHidden="1" w:unhideWhenUsed="1"/>
-    <w:lsdException w:name="Default Paragraph Font" w:semiHidden="1" w:uiPriority="1" w:unhideWhenUsed="1"/>
+    <w:lsdException w:name="Default Paragraph Font" w:uiPriority="1" w:semiHidden="1" w:unhideWhenUsed="1"/>
     <w:lsdException w:name="Body Text" w:semiHidden="1" w:unhideWhenUsed="1"/>
     <w:lsdException w:name="Body Text Indent" w:semiHidden="1" w:unhideWhenUsed="1"/>
     <w:lsdException w:name="List Continue" w:semiHidden="1" w:unhideWhenUsed="1"/>
@@ -2364,8 +2326,8 @@
     <w:lsdException w:name="Subtle Reference" w:uiPriority="31" w:qFormat="1"/>
     <w:lsdException w:name="Intense Reference" w:uiPriority="32" w:qFormat="1"/>
     <w:lsdException w:name="Book Title" w:uiPriority="33" w:qFormat="1"/>
-    <w:lsdException w:name="Bibliography" w:semiHidden="1" w:uiPriority="37" w:unhideWhenUsed="1"/>
-    <w:lsdException w:name="TOC Heading" w:semiHidden="1" w:uiPriority="39" w:unhideWhenUsed="1" w:qFormat="1"/>
+    <w:lsdException w:name="Bibliography" w:uiPriority="37" w:semiHidden="1" w:unhideWhenUsed="1"/>
+    <w:lsdException w:name="TOC Heading" w:uiPriority="39" w:semiHidden="1" w:unhideWhenUsed="1" w:qFormat="1"/>
     <w:lsdException w:name="Plain Table 1" w:uiPriority="41"/>
     <w:lsdException w:name="Plain Table 2" w:uiPriority="42"/>
     <w:lsdException w:name="Plain Table 3" w:uiPriority="43"/>
@@ -2476,7 +2438,7 @@
     <w:lsdException w:name="Unresolved Mention" w:semiHidden="1" w:unhideWhenUsed="1"/>
     <w:lsdException w:name="Smart Link" w:semiHidden="1" w:unhideWhenUsed="1"/>
   </w:latentStyles>
-  <w:style w:type="paragraph" w:default="1" w:styleId="Normal">
+  <w:style w:type="paragraph" w:styleId="Normal" w:default="1">
     <w:name w:val="Normal"/>
     <w:qFormat/>
   </w:style>
@@ -2495,7 +2457,7 @@
       <w:outlineLvl w:val="0"/>
     </w:pPr>
     <w:rPr>
-      <w:rFonts w:asciiTheme="majorHAnsi" w:eastAsiaTheme="majorEastAsia" w:hAnsiTheme="majorHAnsi" w:cstheme="majorBidi"/>
+      <w:rFonts w:asciiTheme="majorHAnsi" w:hAnsiTheme="majorHAnsi" w:eastAsiaTheme="majorEastAsia" w:cstheme="majorBidi"/>
       <w:color w:val="0F4761" w:themeColor="accent1" w:themeShade="BF"/>
       <w:sz w:val="40"/>
       <w:szCs w:val="40"/>
@@ -2518,7 +2480,7 @@
       <w:outlineLvl w:val="1"/>
     </w:pPr>
     <w:rPr>
-      <w:rFonts w:asciiTheme="majorHAnsi" w:eastAsiaTheme="majorEastAsia" w:hAnsiTheme="majorHAnsi" w:cstheme="majorBidi"/>
+      <w:rFonts w:asciiTheme="majorHAnsi" w:hAnsiTheme="majorHAnsi" w:eastAsiaTheme="majorEastAsia" w:cstheme="majorBidi"/>
       <w:color w:val="0F4761" w:themeColor="accent1" w:themeShade="BF"/>
       <w:sz w:val="32"/>
       <w:szCs w:val="32"/>
@@ -2679,12 +2641,12 @@
       <w:color w:val="272727" w:themeColor="text1" w:themeTint="D8"/>
     </w:rPr>
   </w:style>
-  <w:style w:type="character" w:default="1" w:styleId="DefaultParagraphFont">
+  <w:style w:type="character" w:styleId="DefaultParagraphFont" w:default="1">
     <w:name w:val="Default Paragraph Font"/>
     <w:uiPriority w:val="1"/>
     <w:unhideWhenUsed/>
   </w:style>
-  <w:style w:type="table" w:default="1" w:styleId="TableNormal">
+  <w:style w:type="table" w:styleId="TableNormal" w:default="1">
     <w:name w:val="Normal Table"/>
     <w:uiPriority w:val="99"/>
     <w:semiHidden/>
@@ -2699,26 +2661,26 @@
       </w:tblCellMar>
     </w:tblPr>
   </w:style>
-  <w:style w:type="numbering" w:default="1" w:styleId="NoList">
+  <w:style w:type="numbering" w:styleId="NoList" w:default="1">
     <w:name w:val="No List"/>
     <w:uiPriority w:val="99"/>
     <w:semiHidden/>
     <w:unhideWhenUsed/>
   </w:style>
-  <w:style w:type="character" w:customStyle="1" w:styleId="Heading1Char">
+  <w:style w:type="character" w:styleId="Heading1Char" w:customStyle="1">
     <w:name w:val="Heading 1 Char"/>
     <w:basedOn w:val="DefaultParagraphFont"/>
     <w:link w:val="Heading1"/>
     <w:uiPriority w:val="9"/>
     <w:rsid w:val="009D00A3"/>
     <w:rPr>
-      <w:rFonts w:asciiTheme="majorHAnsi" w:eastAsiaTheme="majorEastAsia" w:hAnsiTheme="majorHAnsi" w:cstheme="majorBidi"/>
+      <w:rFonts w:asciiTheme="majorHAnsi" w:hAnsiTheme="majorHAnsi" w:eastAsiaTheme="majorEastAsia" w:cstheme="majorBidi"/>
       <w:color w:val="0F4761" w:themeColor="accent1" w:themeShade="BF"/>
       <w:sz w:val="40"/>
       <w:szCs w:val="40"/>
     </w:rPr>
   </w:style>
-  <w:style w:type="character" w:customStyle="1" w:styleId="Heading2Char">
+  <w:style w:type="character" w:styleId="Heading2Char" w:customStyle="1">
     <w:name w:val="Heading 2 Char"/>
     <w:basedOn w:val="DefaultParagraphFont"/>
     <w:link w:val="Heading2"/>
@@ -2726,13 +2688,13 @@
     <w:semiHidden/>
     <w:rsid w:val="009D00A3"/>
     <w:rPr>
-      <w:rFonts w:asciiTheme="majorHAnsi" w:eastAsiaTheme="majorEastAsia" w:hAnsiTheme="majorHAnsi" w:cstheme="majorBidi"/>
+      <w:rFonts w:asciiTheme="majorHAnsi" w:hAnsiTheme="majorHAnsi" w:eastAsiaTheme="majorEastAsia" w:cstheme="majorBidi"/>
       <w:color w:val="0F4761" w:themeColor="accent1" w:themeShade="BF"/>
       <w:sz w:val="32"/>
       <w:szCs w:val="32"/>
     </w:rPr>
   </w:style>
-  <w:style w:type="character" w:customStyle="1" w:styleId="Heading3Char">
+  <w:style w:type="character" w:styleId="Heading3Char" w:customStyle="1">
     <w:name w:val="Heading 3 Char"/>
     <w:basedOn w:val="DefaultParagraphFont"/>
     <w:link w:val="Heading3"/>
@@ -2746,7 +2708,7 @@
       <w:szCs w:val="28"/>
     </w:rPr>
   </w:style>
-  <w:style w:type="character" w:customStyle="1" w:styleId="Heading4Char">
+  <w:style w:type="character" w:styleId="Heading4Char" w:customStyle="1">
     <w:name w:val="Heading 4 Char"/>
     <w:basedOn w:val="DefaultParagraphFont"/>
     <w:link w:val="Heading4"/>
@@ -2760,7 +2722,7 @@
       <w:color w:val="0F4761" w:themeColor="accent1" w:themeShade="BF"/>
     </w:rPr>
   </w:style>
-  <w:style w:type="character" w:customStyle="1" w:styleId="Heading5Char">
+  <w:style w:type="character" w:styleId="Heading5Char" w:customStyle="1">
     <w:name w:val="Heading 5 Char"/>
     <w:basedOn w:val="DefaultParagraphFont"/>
     <w:link w:val="Heading5"/>
@@ -2772,7 +2734,7 @@
       <w:color w:val="0F4761" w:themeColor="accent1" w:themeShade="BF"/>
     </w:rPr>
   </w:style>
-  <w:style w:type="character" w:customStyle="1" w:styleId="Heading6Char">
+  <w:style w:type="character" w:styleId="Heading6Char" w:customStyle="1">
     <w:name w:val="Heading 6 Char"/>
     <w:basedOn w:val="DefaultParagraphFont"/>
     <w:link w:val="Heading6"/>
@@ -2786,7 +2748,7 @@
       <w:color w:val="595959" w:themeColor="text1" w:themeTint="A6"/>
     </w:rPr>
   </w:style>
-  <w:style w:type="character" w:customStyle="1" w:styleId="Heading7Char">
+  <w:style w:type="character" w:styleId="Heading7Char" w:customStyle="1">
     <w:name w:val="Heading 7 Char"/>
     <w:basedOn w:val="DefaultParagraphFont"/>
     <w:link w:val="Heading7"/>
@@ -2798,7 +2760,7 @@
       <w:color w:val="595959" w:themeColor="text1" w:themeTint="A6"/>
     </w:rPr>
   </w:style>
-  <w:style w:type="character" w:customStyle="1" w:styleId="Heading8Char">
+  <w:style w:type="character" w:styleId="Heading8Char" w:customStyle="1">
     <w:name w:val="Heading 8 Char"/>
     <w:basedOn w:val="DefaultParagraphFont"/>
     <w:link w:val="Heading8"/>
@@ -2812,7 +2774,7 @@
       <w:color w:val="272727" w:themeColor="text1" w:themeTint="D8"/>
     </w:rPr>
   </w:style>
-  <w:style w:type="character" w:customStyle="1" w:styleId="Heading9Char">
+  <w:style w:type="character" w:styleId="Heading9Char" w:customStyle="1">
     <w:name w:val="Heading 9 Char"/>
     <w:basedOn w:val="DefaultParagraphFont"/>
     <w:link w:val="Heading9"/>
@@ -2837,21 +2799,21 @@
       <w:contextualSpacing/>
     </w:pPr>
     <w:rPr>
-      <w:rFonts w:asciiTheme="majorHAnsi" w:eastAsiaTheme="majorEastAsia" w:hAnsiTheme="majorHAnsi" w:cstheme="majorBidi"/>
+      <w:rFonts w:asciiTheme="majorHAnsi" w:hAnsiTheme="majorHAnsi" w:eastAsiaTheme="majorEastAsia" w:cstheme="majorBidi"/>
       <w:spacing w:val="-10"/>
       <w:kern w:val="28"/>
       <w:sz w:val="56"/>
       <w:szCs w:val="56"/>
     </w:rPr>
   </w:style>
-  <w:style w:type="character" w:customStyle="1" w:styleId="TitleChar">
+  <w:style w:type="character" w:styleId="TitleChar" w:customStyle="1">
     <w:name w:val="Title Char"/>
     <w:basedOn w:val="DefaultParagraphFont"/>
     <w:link w:val="Title"/>
     <w:uiPriority w:val="10"/>
     <w:rsid w:val="009D00A3"/>
     <w:rPr>
-      <w:rFonts w:asciiTheme="majorHAnsi" w:eastAsiaTheme="majorEastAsia" w:hAnsiTheme="majorHAnsi" w:cstheme="majorBidi"/>
+      <w:rFonts w:asciiTheme="majorHAnsi" w:hAnsiTheme="majorHAnsi" w:eastAsiaTheme="majorEastAsia" w:cstheme="majorBidi"/>
       <w:spacing w:val="-10"/>
       <w:kern w:val="28"/>
       <w:sz w:val="56"/>
@@ -2879,7 +2841,7 @@
       <w:szCs w:val="28"/>
     </w:rPr>
   </w:style>
-  <w:style w:type="character" w:customStyle="1" w:styleId="SubtitleChar">
+  <w:style w:type="character" w:styleId="SubtitleChar" w:customStyle="1">
     <w:name w:val="Subtitle Char"/>
     <w:basedOn w:val="DefaultParagraphFont"/>
     <w:link w:val="Subtitle"/>
@@ -2911,7 +2873,7 @@
       <w:color w:val="404040" w:themeColor="text1" w:themeTint="BF"/>
     </w:rPr>
   </w:style>
-  <w:style w:type="character" w:customStyle="1" w:styleId="QuoteChar">
+  <w:style w:type="character" w:styleId="QuoteChar" w:customStyle="1">
     <w:name w:val="Quote Char"/>
     <w:basedOn w:val="DefaultParagraphFont"/>
     <w:link w:val="Quote"/>
@@ -2956,8 +2918,8 @@
     <w:rsid w:val="009D00A3"/>
     <w:pPr>
       <w:pBdr>
-        <w:top w:val="single" w:sz="4" w:space="10" w:color="0F4761" w:themeColor="accent1" w:themeShade="BF"/>
-        <w:bottom w:val="single" w:sz="4" w:space="10" w:color="0F4761" w:themeColor="accent1" w:themeShade="BF"/>
+        <w:top w:val="single" w:color="0F4761" w:themeColor="accent1" w:themeShade="BF" w:sz="4" w:space="10"/>
+        <w:bottom w:val="single" w:color="0F4761" w:themeColor="accent1" w:themeShade="BF" w:sz="4" w:space="10"/>
       </w:pBdr>
       <w:spacing w:before="360" w:after="360"/>
       <w:ind w:left="864" w:right="864"/>
@@ -2969,7 +2931,7 @@
       <w:color w:val="0F4761" w:themeColor="accent1" w:themeShade="BF"/>
     </w:rPr>
   </w:style>
-  <w:style w:type="character" w:customStyle="1" w:styleId="IntenseQuoteChar">
+  <w:style w:type="character" w:styleId="IntenseQuoteChar" w:customStyle="1">
     <w:name w:val="Intense Quote Char"/>
     <w:basedOn w:val="DefaultParagraphFont"/>
     <w:link w:val="IntenseQuote"/>
@@ -3023,7 +2985,7 @@
       <w:spacing w:after="0" w:line="240" w:lineRule="auto"/>
     </w:pPr>
   </w:style>
-  <w:style w:type="character" w:customStyle="1" w:styleId="HeaderChar">
+  <w:style w:type="character" w:styleId="HeaderChar" w:customStyle="1">
     <w:name w:val="Header Char"/>
     <w:basedOn w:val="DefaultParagraphFont"/>
     <w:link w:val="Header"/>
@@ -3045,7 +3007,7 @@
       <w:spacing w:after="0" w:line="240" w:lineRule="auto"/>
     </w:pPr>
   </w:style>
-  <w:style w:type="character" w:customStyle="1" w:styleId="FooterChar">
+  <w:style w:type="character" w:styleId="FooterChar" w:customStyle="1">
     <w:name w:val="Footer Char"/>
     <w:basedOn w:val="DefaultParagraphFont"/>
     <w:link w:val="Footer"/>
@@ -3056,7 +3018,7 @@
 </file>
 
 <file path=word/theme/theme1.xml><?xml version="1.0" encoding="utf-8"?>
-<a:theme xmlns:a="http://schemas.openxmlformats.org/drawingml/2006/main" name="Office Theme">
+<a:theme xmlns:a="http://schemas.openxmlformats.org/drawingml/2006/main" xmlns:thm15="http://schemas.microsoft.com/office/thememl/2012/main" name="Office Theme">
   <a:themeElements>
     <a:clrScheme name="Office">
       <a:dk1>

</xml_diff>

<commit_message>
I guess this was left over from before?
</commit_message>
<xml_diff>
--- a/KindFind Privacy Policy.docx
+++ b/KindFind Privacy Policy.docx
@@ -1184,26 +1184,29 @@
         <w:rPr>
           <w:rFonts w:ascii="Arial" w:hAnsi="Arial" w:cs="Arial"/>
         </w:rPr>
-        <w:t xml:space="preserve">If you have any questions or </w:t>
-      </w:r>
-      <w:r>
-        <w:rPr>
-          <w:rFonts w:ascii="Arial" w:hAnsi="Arial" w:cs="Arial"/>
-        </w:rPr>
-        <w:t xml:space="preserve">concerns the </w:t>
-      </w:r>
-      <w:r>
-        <w:rPr>
-          <w:rFonts w:ascii="Arial" w:hAnsi="Arial" w:cs="Arial"/>
-        </w:rPr>
-        <w:t>best way to get in touch with us is through our website</w:t>
-      </w:r>
-      <w:r>
-        <w:rPr>
-          <w:rFonts w:ascii="Arial" w:hAnsi="Arial" w:cs="Arial"/>
-        </w:rPr>
-        <w:t xml:space="preserve"> (INSERT WEBSITE)</w:t>
-      </w:r>
+        <w:t xml:space="preserve">If you have any questions or concerns the best way to </w:t>
+      </w:r>
+      <w:r>
+        <w:rPr>
+          <w:rFonts w:ascii="Arial" w:hAnsi="Arial" w:cs="Arial"/>
+        </w:rPr>
+        <w:t>get in touch with</w:t>
+      </w:r>
+      <w:r>
+        <w:rPr>
+          <w:rFonts w:ascii="Arial" w:hAnsi="Arial" w:cs="Arial"/>
+        </w:rPr>
+        <w:t xml:space="preserve"> us is through our website </w:t>
+      </w:r>
+      <w:hyperlink r:id="R7a10505e7d8d492b">
+        <w:r>
+          <w:rPr>
+            <w:rStyle w:val="Hyperlink"/>
+            <w:rFonts w:ascii="Arial" w:hAnsi="Arial" w:cs="Arial"/>
+          </w:rPr>
+          <w:t>https://sal2099.github.io/kindfind/</w:t>
+        </w:r>
+      </w:hyperlink>
       <w:r>
         <w:rPr>
           <w:rFonts w:ascii="Arial" w:hAnsi="Arial" w:cs="Arial"/>
@@ -1362,6 +1365,17 @@
     </w:p>
   </w:footnote>
 </w:footnotes>
+</file>
+
+<file path=word/intelligence2.xml><?xml version="1.0" encoding="utf-8"?>
+<int2:intelligence xmlns:int2="http://schemas.microsoft.com/office/intelligence/2020/intelligence">
+  <int2:observations>
+    <int2:textHash int2:hashCode="3SRQGi4mnSFBHh" int2:id="FFZ3Zl1e">
+      <int2:state int2:type="spell" int2:value="Rejected"/>
+    </int2:textHash>
+  </int2:observations>
+  <int2:intelligenceSettings/>
+</int2:intelligence>
 </file>
 
 <file path=word/numbering.xml><?xml version="1.0" encoding="utf-8"?>
@@ -3014,6 +3028,17 @@
     <w:uiPriority w:val="99"/>
     <w:rsid w:val="00733E88"/>
   </w:style>
+  <w:style w:type="character" w:styleId="Hyperlink">
+    <w:uiPriority w:val="99"/>
+    <w:name w:val="Hyperlink"/>
+    <w:basedOn w:val="DefaultParagraphFont"/>
+    <w:unhideWhenUsed/>
+    <w:rsid w:val="456B1192"/>
+    <w:rPr>
+      <w:color w:val="467886"/>
+      <w:u w:val="single"/>
+    </w:rPr>
+  </w:style>
 </w:styles>
 </file>
 

</xml_diff>